<commit_message>
Update report: 38 tests, real-F3 coherence validation, SEG-Y export
Co-Authored-By: Claude Opus 4.8 <noreply@anthropic.com>
</commit_message>
<xml_diff>
--- a/Seismic_Workbench_Report.docx
+++ b/Seismic_Workbench_Report.docx
@@ -684,7 +684,7 @@
                 <w:sz w:val="19"/>
                 <w:szCs w:val="19"/>
               </w:rPr>
-              <w:t xml:space="preserve">pytest 8.2  —  37 tests, 0 failures</w:t>
+              <w:t xml:space="preserve">pytest 8.2  —  38 tests, 0 failures</w:t>
             </w:r>
           </w:p>
         </w:tc>
@@ -1000,7 +1000,7 @@
           <w:sz w:val="20"/>
           <w:szCs w:val="20"/>
         </w:rPr>
-        <w:t xml:space="preserve">37 pytest tests (0 failures)</w:t>
+        <w:t xml:space="preserve">38 pytest tests (0 failures)</w:t>
       </w:r>
     </w:p>
     <w:p>
@@ -1738,7 +1738,7 @@
       <w:r>
         <w:t xml:space="preserve">Source: Alaudah et al. (2019) facies classification benchmark, </w:t>
       </w:r>
-      <w:hyperlink w:history="1" r:id="rIdmalmfptulwk9uealpuukt">
+      <w:hyperlink w:history="1" r:id="rIdtcgaof5vslculrttvjg4o">
         <w:r>
           <w:rPr>
             <w:rStyle w:val="Hyperlink"/>
@@ -2041,35 +2041,93 @@
     </w:p>
     <w:p>
       <w:pPr>
-        <w:spacing w:after="160"/>
-      </w:pPr>
-    </w:p>
-    <w:p>
-      <w:r>
-        <w:br w:type="page"/>
-      </w:r>
-    </w:p>
-    <w:p>
-      <w:pPr>
-        <w:pStyle w:val="Heading1"/>
-      </w:pPr>
-      <w:r>
-        <w:t xml:space="preserve">7  Test Suite</w:t>
-      </w:r>
-    </w:p>
-    <w:p>
-      <w:pPr>
-        <w:spacing w:after="120"/>
-      </w:pPr>
-      <w:r>
-        <w:t xml:space="preserve">Total: </w:t>
-      </w:r>
+        <w:pStyle w:val="ListParagraph"/>
+        <w:numPr>
+          <w:ilvl w:val="0"/>
+          <w:numId w:val="2"/>
+        </w:numPr>
+        <w:spacing w:after="80"/>
+      </w:pPr>
       <w:r>
         <w:rPr>
           <w:b/>
           <w:bCs/>
         </w:rPr>
-        <w:t xml:space="preserve">37 tests, 0 failures</w:t>
+        <w:t xml:space="preserve">SEG-Y export: </w:t>
+      </w:r>
+      <w:r>
+        <w:t xml:space="preserve">any computed attribute volume (including coherence) can be written back to a 3D SEG-Y and downloaded from the app.</w:t>
+      </w:r>
+    </w:p>
+    <w:p>
+      <w:pPr>
+        <w:spacing w:after="160"/>
+      </w:pPr>
+    </w:p>
+    <w:p>
+      <w:pPr>
+        <w:pStyle w:val="Heading2"/>
+      </w:pPr>
+      <w:r>
+        <w:t xml:space="preserve">6.4  Validation on Real F3 Data</w:t>
+      </w:r>
+    </w:p>
+    <w:p>
+      <w:pPr>
+        <w:spacing w:after="120"/>
+      </w:pPr>
+      <w:r>
+        <w:t xml:space="preserve">Running the full F3 train cube (401 × 701 × 255 samples) through </w:t>
+      </w:r>
+      <w:r>
+        <w:rPr>
+          <w:rFonts w:ascii="Consolas" w:cs="Consolas" w:eastAsia="Consolas" w:hAnsi="Consolas"/>
+          <w:sz w:val="20"/>
+          <w:szCs w:val="20"/>
+        </w:rPr>
+        <w:t xml:space="preserve">scripts/f3_coherence_qc.py</w:t>
+      </w:r>
+      <w:r>
+        <w:t xml:space="preserve"> computes coherence in approximately 3 seconds (three uniform-filter passes, float32). Median coherence is 0.926 with 6–7% of each time slice flagged below the 0.5 fault threshold. The resulting time slices clearly resolve the dataset’s well-documented polygonal fault networks and the structural feature in the north-west of the survey; on inline sections, fault planes appear as vertical low-coherence streaks coinciding with visible reflector offsets. QC figures are committed under </w:t>
+      </w:r>
+      <w:r>
+        <w:rPr>
+          <w:rFonts w:ascii="Consolas" w:cs="Consolas" w:eastAsia="Consolas" w:hAnsi="Consolas"/>
+          <w:sz w:val="20"/>
+          <w:szCs w:val="20"/>
+        </w:rPr>
+        <w:t xml:space="preserve">docs/img/</w:t>
+      </w:r>
+      <w:r>
+        <w:t xml:space="preserve">.</w:t>
+      </w:r>
+    </w:p>
+    <w:p>
+      <w:r>
+        <w:br w:type="page"/>
+      </w:r>
+    </w:p>
+    <w:p>
+      <w:pPr>
+        <w:pStyle w:val="Heading1"/>
+      </w:pPr>
+      <w:r>
+        <w:t xml:space="preserve">7  Test Suite</w:t>
+      </w:r>
+    </w:p>
+    <w:p>
+      <w:pPr>
+        <w:spacing w:after="120"/>
+      </w:pPr>
+      <w:r>
+        <w:t xml:space="preserve">Total: </w:t>
+      </w:r>
+      <w:r>
+        <w:rPr>
+          <w:b/>
+          <w:bCs/>
+        </w:rPr>
+        <w:t xml:space="preserve">38 tests, 0 failures</w:t>
       </w:r>
       <w:r>
         <w:t xml:space="preserve">. Run with </w:t>
@@ -2858,7 +2916,7 @@
                 <w:sz w:val="19"/>
                 <w:szCs w:val="19"/>
               </w:rPr>
-              <w:t xml:space="preserve">5</w:t>
+              <w:t xml:space="preserve">6</w:t>
             </w:r>
           </w:p>
         </w:tc>
@@ -2886,7 +2944,7 @@
                 <w:sz w:val="19"/>
                 <w:szCs w:val="19"/>
               </w:rPr>
-              <w:t xml:space="preserve">Pre-stack smoke, post-stack smoke, attribute switch, coherence overlay, time-slice coherence overlay</w:t>
+              <w:t xml:space="preserve">Pre-stack smoke, post-stack smoke, attribute switch, coherence overlay, time-slice coherence overlay, SEG-Y attribute export</w:t>
             </w:r>
           </w:p>
         </w:tc>
@@ -2944,7 +3002,7 @@
         <w:spacing w:after="120"/>
       </w:pPr>
       <w:r>
-        <w:t xml:space="preserve">Requirements: numpy≥01.26, scipy≥1.13, segyio≥1.9, matplotlib≥3.8, pandas≥2.0, streamlit≥1.40, pytest≥8.0.</w:t>
+        <w:t xml:space="preserve">Requirements: numpy≥1.26, scipy≥1.13, segyio≥1.9, matplotlib≥3.8, pandas≥2.0, streamlit≥1.40, pytest≥8.0.</w:t>
       </w:r>
     </w:p>
     <w:p>
@@ -3194,7 +3252,7 @@
       <w:r>
         <w:t xml:space="preserve">Dataset: </w:t>
       </w:r>
-      <w:hyperlink w:history="1" r:id="rIdzawoayc4ocgtumwm3c5bw">
+      <w:hyperlink w:history="1" r:id="rIduf3vygqguupyjrmdjwmxv">
         <w:r>
           <w:rPr>
             <w:rStyle w:val="Hyperlink"/>

</xml_diff>